<commit_message>
Added Strategy design pattern
</commit_message>
<xml_diff>
--- a/DesignPattern/Design pattern interview questions and answers.docx
+++ b/DesignPattern/Design pattern interview questions and answers.docx
@@ -329,7 +329,27 @@
           <w:rtl/>
           <w:lang w:bidi="fa-IR"/>
         </w:rPr>
-        <w:t xml:space="preserve"> صرفا یه کلاس هست که پیاده سازی ها مختلف یه متد رو داخل خودش نگه میداره و بسته به خواسته </w:t>
+        <w:t xml:space="preserve"> صرفا یه کلاس هست که </w:t>
+      </w:r>
+      <w:r>
+        <w:rPr>
+          <w:rFonts w:cs="B Nazanin" w:hint="cs"/>
+          <w:sz w:val="28"/>
+          <w:szCs w:val="28"/>
+          <w:rtl/>
+          <w:lang w:bidi="fa-IR"/>
+        </w:rPr>
+        <w:t>شکل های مختلف یه کلاس رو</w:t>
+      </w:r>
+      <w:r>
+        <w:rPr>
+          <w:rFonts w:cs="B Nazanin" w:hint="cs"/>
+          <w:sz w:val="28"/>
+          <w:szCs w:val="28"/>
+          <w:rtl/>
+          <w:lang w:bidi="fa-IR"/>
+        </w:rPr>
+        <w:t xml:space="preserve"> بسته به خواسته </w:t>
       </w:r>
       <w:r>
         <w:rPr>
@@ -348,7 +368,27 @@
           <w:rtl/>
           <w:lang w:bidi="fa-IR"/>
         </w:rPr>
-        <w:t>،‌ پیاده سازی مورد نیاز رو بهش برمیگردونه.</w:t>
+        <w:t>،</w:t>
+      </w:r>
+      <w:r>
+        <w:rPr>
+          <w:rFonts w:cs="B Nazanin" w:hint="cs"/>
+          <w:sz w:val="28"/>
+          <w:szCs w:val="28"/>
+          <w:rtl/>
+          <w:lang w:bidi="fa-IR"/>
+        </w:rPr>
+        <w:t xml:space="preserve"> (مثلا از طریق یه ورودی یا وضعیت موجود)</w:t>
+      </w:r>
+      <w:r>
+        <w:rPr>
+          <w:rFonts w:cs="B Nazanin" w:hint="cs"/>
+          <w:sz w:val="28"/>
+          <w:szCs w:val="28"/>
+          <w:rtl/>
+          <w:lang w:bidi="fa-IR"/>
+        </w:rPr>
+        <w:t>‌ بهش برمیگردونه.</w:t>
       </w:r>
     </w:p>
     <w:p>
@@ -1233,7 +1273,7 @@
           <w:lang w:bidi="fa-IR"/>
         </w:rPr>
         <w:lastRenderedPageBreak/>
-        <w:t>Singleton</w:t>
+        <w:t>Abstract factory</w:t>
       </w:r>
       <w:r>
         <w:rPr>
@@ -1269,7 +1309,7 @@
           <w:rtl/>
           <w:lang w:bidi="fa-IR"/>
         </w:rPr>
-        <w:t xml:space="preserve">یه </w:t>
+        <w:t xml:space="preserve">از نوع </w:t>
       </w:r>
       <w:r>
         <w:rPr>
@@ -1288,236 +1328,7 @@
           <w:rtl/>
           <w:lang w:bidi="fa-IR"/>
         </w:rPr>
-        <w:t xml:space="preserve"> هست که </w:t>
-      </w:r>
-      <w:r>
-        <w:rPr>
-          <w:rFonts w:cs="B Nazanin" w:hint="cs"/>
-          <w:sz w:val="28"/>
-          <w:szCs w:val="28"/>
-          <w:rtl/>
-          <w:lang w:bidi="fa-IR"/>
-        </w:rPr>
-        <w:t xml:space="preserve">برای ساخت </w:t>
-      </w:r>
-      <w:r>
-        <w:rPr>
-          <w:rFonts w:cs="B Nazanin"/>
-          <w:sz w:val="28"/>
-          <w:szCs w:val="28"/>
-          <w:lang w:bidi="fa-IR"/>
-        </w:rPr>
-        <w:t>instance</w:t>
-      </w:r>
-      <w:r>
-        <w:rPr>
-          <w:rFonts w:cs="B Nazanin" w:hint="cs"/>
-          <w:sz w:val="28"/>
-          <w:szCs w:val="28"/>
-          <w:rtl/>
-          <w:lang w:bidi="fa-IR"/>
-        </w:rPr>
-        <w:t xml:space="preserve"> از کلاس هایی استفاده میشه که میخوایم در طول اجرای برنامه فقط یه </w:t>
-      </w:r>
-      <w:r>
-        <w:rPr>
-          <w:rFonts w:cs="B Nazanin"/>
-          <w:sz w:val="28"/>
-          <w:szCs w:val="28"/>
-          <w:lang w:bidi="fa-IR"/>
-        </w:rPr>
-        <w:t>instance</w:t>
-      </w:r>
-      <w:r>
-        <w:rPr>
-          <w:rFonts w:cs="B Nazanin" w:hint="cs"/>
-          <w:sz w:val="28"/>
-          <w:szCs w:val="28"/>
-          <w:rtl/>
-          <w:lang w:bidi="fa-IR"/>
-        </w:rPr>
-        <w:t xml:space="preserve"> از اون کلاس رو داشته باشیم. برای نمونه، هر برنامه ای نیاز به یه </w:t>
-      </w:r>
-      <w:r>
-        <w:rPr>
-          <w:rFonts w:cs="B Nazanin"/>
-          <w:sz w:val="28"/>
-          <w:szCs w:val="28"/>
-          <w:lang w:bidi="fa-IR"/>
-        </w:rPr>
-        <w:t>logger</w:t>
-      </w:r>
-      <w:r>
-        <w:rPr>
-          <w:rFonts w:cs="B Nazanin" w:hint="cs"/>
-          <w:sz w:val="28"/>
-          <w:szCs w:val="28"/>
-          <w:rtl/>
-          <w:lang w:bidi="fa-IR"/>
-        </w:rPr>
-        <w:t xml:space="preserve"> داره که برای قسمت های مختلف برنامه </w:t>
-      </w:r>
-      <w:r>
-        <w:rPr>
-          <w:rFonts w:cs="B Nazanin"/>
-          <w:sz w:val="28"/>
-          <w:szCs w:val="28"/>
-          <w:lang w:bidi="fa-IR"/>
-        </w:rPr>
-        <w:t>log</w:t>
-      </w:r>
-      <w:r>
-        <w:rPr>
-          <w:rFonts w:cs="B Nazanin" w:hint="cs"/>
-          <w:sz w:val="28"/>
-          <w:szCs w:val="28"/>
-          <w:rtl/>
-          <w:lang w:bidi="fa-IR"/>
-        </w:rPr>
-        <w:t xml:space="preserve"> بندازه. زمانیکه میخوایم </w:t>
-      </w:r>
-      <w:r>
-        <w:rPr>
-          <w:rFonts w:cs="B Nazanin"/>
-          <w:sz w:val="28"/>
-          <w:szCs w:val="28"/>
-          <w:lang w:bidi="fa-IR"/>
-        </w:rPr>
-        <w:t>logger</w:t>
-      </w:r>
-      <w:r>
-        <w:rPr>
-          <w:rFonts w:cs="B Nazanin" w:hint="cs"/>
-          <w:sz w:val="28"/>
-          <w:szCs w:val="28"/>
-          <w:rtl/>
-          <w:lang w:bidi="fa-IR"/>
-        </w:rPr>
-        <w:t xml:space="preserve"> رو </w:t>
-      </w:r>
-      <w:r>
-        <w:rPr>
-          <w:rFonts w:cs="B Nazanin"/>
-          <w:sz w:val="28"/>
-          <w:szCs w:val="28"/>
-          <w:lang w:bidi="fa-IR"/>
-        </w:rPr>
-        <w:t>new</w:t>
-      </w:r>
-      <w:r>
-        <w:rPr>
-          <w:rFonts w:cs="B Nazanin" w:hint="cs"/>
-          <w:sz w:val="28"/>
-          <w:szCs w:val="28"/>
-          <w:rtl/>
-          <w:lang w:bidi="fa-IR"/>
-        </w:rPr>
-        <w:t xml:space="preserve"> کنیم، چیزایی مثل زمان شروع اجرای برنامه (که خب معمولا بعد از اجرای برنامه با یه </w:t>
-      </w:r>
-      <w:r>
-        <w:rPr>
-          <w:rFonts w:cs="B Nazanin"/>
-          <w:sz w:val="28"/>
-          <w:szCs w:val="28"/>
-          <w:lang w:bidi="fa-IR"/>
-        </w:rPr>
-        <w:t>Datetime.Now</w:t>
-      </w:r>
-      <w:r>
-        <w:rPr>
-          <w:rFonts w:cs="B Nazanin" w:hint="cs"/>
-          <w:sz w:val="28"/>
-          <w:szCs w:val="28"/>
-          <w:rtl/>
-          <w:lang w:bidi="fa-IR"/>
-        </w:rPr>
-        <w:t xml:space="preserve"> مقداردهی میشه) رو داریم براش تعیین می کنیم؛ اگه این کلاس قرار باشه با هر بار </w:t>
-      </w:r>
-      <w:r>
-        <w:rPr>
-          <w:rFonts w:cs="B Nazanin"/>
-          <w:sz w:val="28"/>
-          <w:szCs w:val="28"/>
-          <w:lang w:bidi="fa-IR"/>
-        </w:rPr>
-        <w:t>new</w:t>
-      </w:r>
-      <w:r>
-        <w:rPr>
-          <w:rFonts w:cs="B Nazanin" w:hint="cs"/>
-          <w:sz w:val="28"/>
-          <w:szCs w:val="28"/>
-          <w:rtl/>
-          <w:lang w:bidi="fa-IR"/>
-        </w:rPr>
-        <w:t xml:space="preserve"> کردن اش زمان شروع اجرای برنامه </w:t>
-      </w:r>
-      <w:r>
-        <w:rPr>
-          <w:rFonts w:cs="B Nazanin" w:hint="cs"/>
-          <w:sz w:val="28"/>
-          <w:szCs w:val="28"/>
-          <w:rtl/>
-          <w:lang w:bidi="fa-IR"/>
-        </w:rPr>
-        <w:t xml:space="preserve">رو برای هر </w:t>
-      </w:r>
-      <w:r>
-        <w:rPr>
-          <w:rFonts w:cs="B Nazanin"/>
-          <w:sz w:val="28"/>
-          <w:szCs w:val="28"/>
-          <w:lang w:bidi="fa-IR"/>
-        </w:rPr>
-        <w:t>instance</w:t>
-      </w:r>
-      <w:r>
-        <w:rPr>
-          <w:rFonts w:cs="B Nazanin" w:hint="cs"/>
-          <w:sz w:val="28"/>
-          <w:szCs w:val="28"/>
-          <w:rtl/>
-          <w:lang w:bidi="fa-IR"/>
-        </w:rPr>
-        <w:t xml:space="preserve"> اش تغییر بده، دیگه اون زمان </w:t>
-      </w:r>
-      <w:r>
-        <w:rPr>
-          <w:rFonts w:cs="B Nazanin"/>
-          <w:sz w:val="28"/>
-          <w:szCs w:val="28"/>
-          <w:lang w:bidi="fa-IR"/>
-        </w:rPr>
-        <w:t>valid</w:t>
-      </w:r>
-      <w:r>
-        <w:rPr>
-          <w:rFonts w:cs="B Nazanin" w:hint="cs"/>
-          <w:sz w:val="28"/>
-          <w:szCs w:val="28"/>
-          <w:rtl/>
-          <w:lang w:bidi="fa-IR"/>
-        </w:rPr>
-        <w:t xml:space="preserve"> نیست. پس لازمه که از این کلاس، همیشه یه </w:t>
-      </w:r>
-      <w:r>
-        <w:rPr>
-          <w:rFonts w:cs="B Nazanin"/>
-          <w:sz w:val="28"/>
-          <w:szCs w:val="28"/>
-          <w:lang w:bidi="fa-IR"/>
-        </w:rPr>
-        <w:t>instance</w:t>
-      </w:r>
-      <w:r>
-        <w:rPr>
-          <w:rFonts w:cs="B Nazanin" w:hint="cs"/>
-          <w:sz w:val="28"/>
-          <w:szCs w:val="28"/>
-          <w:rtl/>
-          <w:lang w:bidi="fa-IR"/>
-        </w:rPr>
-        <w:t xml:space="preserve"> در کل برنامه در زمان اجراش داشته باشیم.</w:t>
+        <w:t xml:space="preserve"> هاس. </w:t>
       </w:r>
     </w:p>
     <w:p>
@@ -1543,6 +1354,1488 @@
           <w:rtl/>
           <w:lang w:bidi="fa-IR"/>
         </w:rPr>
+        <w:t xml:space="preserve">در ظاهر خیلی مشابه </w:t>
+      </w:r>
+      <w:r>
+        <w:rPr>
+          <w:rFonts w:cs="B Nazanin"/>
+          <w:sz w:val="28"/>
+          <w:szCs w:val="28"/>
+          <w:lang w:bidi="fa-IR"/>
+        </w:rPr>
+        <w:t>Factory method</w:t>
+      </w:r>
+      <w:r>
+        <w:rPr>
+          <w:rFonts w:cs="B Nazanin" w:hint="cs"/>
+          <w:sz w:val="28"/>
+          <w:szCs w:val="28"/>
+          <w:rtl/>
+          <w:lang w:bidi="fa-IR"/>
+        </w:rPr>
+        <w:t xml:space="preserve"> ئه و تا حد زیادی هم مثل همون عمل میکنه اما یه تفاوت مهم داره. </w:t>
+      </w:r>
+      <w:r>
+        <w:rPr>
+          <w:rFonts w:cs="B Nazanin" w:hint="cs"/>
+          <w:sz w:val="28"/>
+          <w:szCs w:val="28"/>
+          <w:rtl/>
+          <w:lang w:bidi="fa-IR"/>
+        </w:rPr>
+        <w:t>اینکه توی این پترن ما فقط به دنبال ایجاد یه شئ (</w:t>
+      </w:r>
+      <w:r>
+        <w:rPr>
+          <w:rFonts w:cs="B Nazanin"/>
+          <w:sz w:val="28"/>
+          <w:szCs w:val="28"/>
+          <w:lang w:bidi="fa-IR"/>
+        </w:rPr>
+        <w:t>Product</w:t>
+      </w:r>
+      <w:r>
+        <w:rPr>
+          <w:rFonts w:cs="B Nazanin" w:hint="cs"/>
+          <w:sz w:val="28"/>
+          <w:szCs w:val="28"/>
+          <w:rtl/>
+          <w:lang w:bidi="fa-IR"/>
+        </w:rPr>
+        <w:t>) نیستیم بلکه مجموعه ای از اشیای مرتبط یا وابسته به همدیگه رو میخوایم بسازیم. هر پکیج یا مجموعه،‌ اشیای مرتبط به خودشو میسازه و قرار نیست در خروجی این پترن، اشیای نامرتبط به یه مجموعه رو براش تولید کنیم.</w:t>
+      </w:r>
+      <w:r>
+        <w:rPr>
+          <w:rFonts w:cs="B Nazanin" w:hint="cs"/>
+          <w:sz w:val="28"/>
+          <w:szCs w:val="28"/>
+          <w:rtl/>
+          <w:lang w:bidi="fa-IR"/>
+        </w:rPr>
+        <w:t xml:space="preserve"> پس انگار که همون </w:t>
+      </w:r>
+      <w:r>
+        <w:rPr>
+          <w:rFonts w:cs="B Nazanin"/>
+          <w:sz w:val="28"/>
+          <w:szCs w:val="28"/>
+          <w:lang w:bidi="fa-IR"/>
+        </w:rPr>
+        <w:t>Factory method</w:t>
+      </w:r>
+      <w:r>
+        <w:rPr>
+          <w:rFonts w:cs="B Nazanin" w:hint="cs"/>
+          <w:sz w:val="28"/>
+          <w:szCs w:val="28"/>
+          <w:rtl/>
+          <w:lang w:bidi="fa-IR"/>
+        </w:rPr>
+        <w:t xml:space="preserve"> رو داریم استفاده میکنیم اما برای چندتا </w:t>
+      </w:r>
+      <w:r>
+        <w:rPr>
+          <w:rFonts w:cs="B Nazanin"/>
+          <w:sz w:val="28"/>
+          <w:szCs w:val="28"/>
+          <w:lang w:bidi="fa-IR"/>
+        </w:rPr>
+        <w:t>Product</w:t>
+      </w:r>
+      <w:r>
+        <w:rPr>
+          <w:rFonts w:cs="B Nazanin" w:hint="cs"/>
+          <w:sz w:val="28"/>
+          <w:szCs w:val="28"/>
+          <w:rtl/>
+          <w:lang w:bidi="fa-IR"/>
+        </w:rPr>
+        <w:t xml:space="preserve"> که به هم مرتبط یا وابسته ان.</w:t>
+      </w:r>
+    </w:p>
+    <w:p>
+      <w:pPr>
+        <w:pStyle w:val="ListParagraph"/>
+        <w:numPr>
+          <w:ilvl w:val="1"/>
+          <w:numId w:val="1"/>
+        </w:numPr>
+        <w:bidi/>
+        <w:rPr>
+          <w:rFonts w:cs="B Nazanin"/>
+          <w:sz w:val="28"/>
+          <w:szCs w:val="28"/>
+          <w:lang w:bidi="fa-IR"/>
+        </w:rPr>
+      </w:pPr>
+      <w:r>
+        <w:rPr>
+          <w:rFonts w:cs="B Nazanin" w:hint="cs"/>
+          <w:sz w:val="28"/>
+          <w:szCs w:val="28"/>
+          <w:rtl/>
+          <w:lang w:bidi="fa-IR"/>
+        </w:rPr>
+        <w:t xml:space="preserve">اگه بخوایم از روی </w:t>
+      </w:r>
+      <w:r>
+        <w:rPr>
+          <w:rFonts w:cs="B Nazanin"/>
+          <w:sz w:val="28"/>
+          <w:szCs w:val="28"/>
+          <w:lang w:bidi="fa-IR"/>
+        </w:rPr>
+        <w:t>factory method</w:t>
+      </w:r>
+      <w:r>
+        <w:rPr>
+          <w:rFonts w:cs="B Nazanin" w:hint="cs"/>
+          <w:sz w:val="28"/>
+          <w:szCs w:val="28"/>
+          <w:rtl/>
+          <w:lang w:bidi="fa-IR"/>
+        </w:rPr>
+        <w:t xml:space="preserve"> بگیم، به جای یه اینترفیس </w:t>
+      </w:r>
+      <w:r>
+        <w:rPr>
+          <w:rFonts w:cs="B Nazanin"/>
+          <w:sz w:val="28"/>
+          <w:szCs w:val="28"/>
+          <w:lang w:bidi="fa-IR"/>
+        </w:rPr>
+        <w:t>Product</w:t>
+      </w:r>
+      <w:r>
+        <w:rPr>
+          <w:rFonts w:cs="B Nazanin" w:hint="cs"/>
+          <w:sz w:val="28"/>
+          <w:szCs w:val="28"/>
+          <w:rtl/>
+          <w:lang w:bidi="fa-IR"/>
+        </w:rPr>
+        <w:t xml:space="preserve">، چندتا اینترفیس مختلف داریم که </w:t>
+      </w:r>
+      <w:r>
+        <w:rPr>
+          <w:rFonts w:cs="B Nazanin"/>
+          <w:sz w:val="28"/>
+          <w:szCs w:val="28"/>
+          <w:lang w:bidi="fa-IR"/>
+        </w:rPr>
+        <w:t>Product</w:t>
+      </w:r>
+      <w:r>
+        <w:rPr>
+          <w:rFonts w:cs="B Nazanin" w:hint="cs"/>
+          <w:sz w:val="28"/>
+          <w:szCs w:val="28"/>
+          <w:rtl/>
+          <w:lang w:bidi="fa-IR"/>
+        </w:rPr>
+        <w:t xml:space="preserve"> های مختلفی رو نمایندگی میکنن. </w:t>
+      </w:r>
+      <w:r>
+        <w:rPr>
+          <w:rFonts w:cs="B Nazanin"/>
+          <w:sz w:val="28"/>
+          <w:szCs w:val="28"/>
+          <w:rtl/>
+          <w:lang w:bidi="fa-IR"/>
+        </w:rPr>
+        <w:br/>
+      </w:r>
+      <w:r>
+        <w:rPr>
+          <w:rFonts w:cs="B Nazanin" w:hint="cs"/>
+          <w:sz w:val="28"/>
+          <w:szCs w:val="28"/>
+          <w:rtl/>
+          <w:lang w:bidi="fa-IR"/>
+        </w:rPr>
+        <w:t xml:space="preserve">کلاس </w:t>
+      </w:r>
+      <w:r>
+        <w:rPr>
+          <w:rFonts w:cs="B Nazanin"/>
+          <w:sz w:val="28"/>
+          <w:szCs w:val="28"/>
+          <w:lang w:bidi="fa-IR"/>
+        </w:rPr>
+        <w:t>Creator</w:t>
+      </w:r>
+      <w:r>
+        <w:rPr>
+          <w:rFonts w:cs="B Nazanin" w:hint="cs"/>
+          <w:sz w:val="28"/>
+          <w:szCs w:val="28"/>
+          <w:rtl/>
+          <w:lang w:bidi="fa-IR"/>
+        </w:rPr>
+        <w:t xml:space="preserve"> ما حالا بیشتر از یه متد </w:t>
+      </w:r>
+      <w:r>
+        <w:rPr>
+          <w:rFonts w:cs="B Nazanin"/>
+          <w:sz w:val="28"/>
+          <w:szCs w:val="28"/>
+          <w:lang w:bidi="fa-IR"/>
+        </w:rPr>
+        <w:t>CreateProduct</w:t>
+      </w:r>
+      <w:r>
+        <w:rPr>
+          <w:rFonts w:cs="B Nazanin" w:hint="cs"/>
+          <w:sz w:val="28"/>
+          <w:szCs w:val="28"/>
+          <w:rtl/>
+          <w:lang w:bidi="fa-IR"/>
+        </w:rPr>
+        <w:t xml:space="preserve"> داره و در واقع به تعداد </w:t>
+      </w:r>
+      <w:r>
+        <w:rPr>
+          <w:rFonts w:cs="B Nazanin"/>
+          <w:sz w:val="28"/>
+          <w:szCs w:val="28"/>
+          <w:lang w:bidi="fa-IR"/>
+        </w:rPr>
+        <w:t>Product</w:t>
+      </w:r>
+      <w:r>
+        <w:rPr>
+          <w:rFonts w:cs="B Nazanin" w:hint="cs"/>
+          <w:sz w:val="28"/>
+          <w:szCs w:val="28"/>
+          <w:rtl/>
+          <w:lang w:bidi="fa-IR"/>
+        </w:rPr>
+        <w:t xml:space="preserve"> ها هست.</w:t>
+      </w:r>
+      <w:r>
+        <w:rPr>
+          <w:rFonts w:cs="B Nazanin" w:hint="cs"/>
+          <w:sz w:val="28"/>
+          <w:szCs w:val="28"/>
+          <w:rtl/>
+          <w:lang w:bidi="fa-IR"/>
+        </w:rPr>
+        <w:t xml:space="preserve"> </w:t>
+      </w:r>
+      <w:r>
+        <w:rPr>
+          <w:rFonts w:cs="B Nazanin"/>
+          <w:sz w:val="28"/>
+          <w:szCs w:val="28"/>
+          <w:rtl/>
+          <w:lang w:bidi="fa-IR"/>
+        </w:rPr>
+        <w:br/>
+      </w:r>
+      <w:r>
+        <w:rPr>
+          <w:rFonts w:cs="B Nazanin"/>
+          <w:sz w:val="28"/>
+          <w:szCs w:val="28"/>
+          <w:lang w:bidi="fa-IR"/>
+        </w:rPr>
+        <w:t>ConcreteCreator</w:t>
+      </w:r>
+      <w:r>
+        <w:rPr>
+          <w:rFonts w:cs="B Nazanin" w:hint="cs"/>
+          <w:sz w:val="28"/>
+          <w:szCs w:val="28"/>
+          <w:rtl/>
+          <w:lang w:bidi="fa-IR"/>
+        </w:rPr>
+        <w:t xml:space="preserve"> ها که از </w:t>
+      </w:r>
+      <w:r>
+        <w:rPr>
+          <w:rFonts w:cs="B Nazanin"/>
+          <w:sz w:val="28"/>
+          <w:szCs w:val="28"/>
+          <w:lang w:bidi="fa-IR"/>
+        </w:rPr>
+        <w:t>Creator</w:t>
+      </w:r>
+      <w:r>
+        <w:rPr>
+          <w:rFonts w:cs="B Nazanin" w:hint="cs"/>
+          <w:sz w:val="28"/>
+          <w:szCs w:val="28"/>
+          <w:rtl/>
+          <w:lang w:bidi="fa-IR"/>
+        </w:rPr>
+        <w:t xml:space="preserve"> ارث بری میکنن چندین مدل مختلف میتونن باشن و بستگی به نیازمندی ما داره. در نهایت </w:t>
+      </w:r>
+      <w:r>
+        <w:rPr>
+          <w:rFonts w:cs="B Nazanin"/>
+          <w:sz w:val="28"/>
+          <w:szCs w:val="28"/>
+          <w:lang w:bidi="fa-IR"/>
+        </w:rPr>
+        <w:t>ConcreteProduct</w:t>
+      </w:r>
+      <w:r>
+        <w:rPr>
+          <w:rFonts w:cs="B Nazanin" w:hint="cs"/>
+          <w:sz w:val="28"/>
+          <w:szCs w:val="28"/>
+          <w:rtl/>
+          <w:lang w:bidi="fa-IR"/>
+        </w:rPr>
+        <w:t xml:space="preserve"> ها هستن که اینا هم بسته به انواع مختلفی که هر </w:t>
+      </w:r>
+      <w:r>
+        <w:rPr>
+          <w:rFonts w:cs="B Nazanin"/>
+          <w:sz w:val="28"/>
+          <w:szCs w:val="28"/>
+          <w:lang w:bidi="fa-IR"/>
+        </w:rPr>
+        <w:t>Product</w:t>
+      </w:r>
+      <w:r>
+        <w:rPr>
+          <w:rFonts w:cs="B Nazanin" w:hint="cs"/>
+          <w:sz w:val="28"/>
+          <w:szCs w:val="28"/>
+          <w:rtl/>
+          <w:lang w:bidi="fa-IR"/>
+        </w:rPr>
+        <w:t xml:space="preserve"> میتونه ساخته بشه، تعدادشون متغیره</w:t>
+      </w:r>
+      <w:r>
+        <w:rPr>
+          <w:rFonts w:cs="B Nazanin" w:hint="cs"/>
+          <w:sz w:val="28"/>
+          <w:szCs w:val="28"/>
+          <w:rtl/>
+          <w:lang w:bidi="fa-IR"/>
+        </w:rPr>
+        <w:t>.</w:t>
+      </w:r>
+    </w:p>
+    <w:p>
+      <w:pPr>
+        <w:pStyle w:val="ListParagraph"/>
+        <w:numPr>
+          <w:ilvl w:val="1"/>
+          <w:numId w:val="1"/>
+        </w:numPr>
+        <w:bidi/>
+        <w:rPr>
+          <w:rFonts w:cs="B Nazanin"/>
+          <w:sz w:val="28"/>
+          <w:szCs w:val="28"/>
+          <w:lang w:bidi="fa-IR"/>
+        </w:rPr>
+      </w:pPr>
+      <w:r>
+        <w:rPr>
+          <w:rFonts w:cs="B Nazanin" w:hint="cs"/>
+          <w:sz w:val="28"/>
+          <w:szCs w:val="28"/>
+          <w:rtl/>
+          <w:lang w:bidi="fa-IR"/>
+        </w:rPr>
+        <w:t>یه نکته مهم که داره اینه که برای هر مجموعه از اشیا (</w:t>
+      </w:r>
+      <w:r>
+        <w:rPr>
+          <w:rFonts w:cs="B Nazanin"/>
+          <w:sz w:val="28"/>
+          <w:szCs w:val="28"/>
+          <w:lang w:bidi="fa-IR"/>
+        </w:rPr>
+        <w:t>Product</w:t>
+      </w:r>
+      <w:r>
+        <w:rPr>
+          <w:rFonts w:cs="B Nazanin" w:hint="cs"/>
+          <w:sz w:val="28"/>
+          <w:szCs w:val="28"/>
+          <w:rtl/>
+          <w:lang w:bidi="fa-IR"/>
+        </w:rPr>
+        <w:t xml:space="preserve"> ها)،‌ فقط اشیای مرتبط ساخته میشن و اگر توی یه مجموعه قرار باشه از مثلا </w:t>
+      </w:r>
+      <w:r>
+        <w:rPr>
+          <w:rFonts w:cs="B Nazanin"/>
+          <w:sz w:val="28"/>
+          <w:szCs w:val="28"/>
+          <w:lang w:bidi="fa-IR"/>
+        </w:rPr>
+        <w:t>ConcreteProductA</w:t>
+      </w:r>
+      <w:r>
+        <w:rPr>
+          <w:rFonts w:cs="B Nazanin" w:hint="cs"/>
+          <w:sz w:val="28"/>
+          <w:szCs w:val="28"/>
+          <w:rtl/>
+          <w:lang w:bidi="fa-IR"/>
+        </w:rPr>
+        <w:t xml:space="preserve"> بسازیم،‌ دیگه امکان اینکه توی همون مجموعه از </w:t>
+      </w:r>
+      <w:r>
+        <w:rPr>
+          <w:rFonts w:cs="B Nazanin"/>
+          <w:sz w:val="28"/>
+          <w:szCs w:val="28"/>
+          <w:lang w:bidi="fa-IR"/>
+        </w:rPr>
+        <w:t>ConcreteProductB</w:t>
+      </w:r>
+      <w:r>
+        <w:rPr>
+          <w:rFonts w:cs="B Nazanin" w:hint="cs"/>
+          <w:sz w:val="28"/>
+          <w:szCs w:val="28"/>
+          <w:rtl/>
+          <w:lang w:bidi="fa-IR"/>
+        </w:rPr>
+        <w:t xml:space="preserve"> بسازیم وجود نداره.</w:t>
+      </w:r>
+    </w:p>
+    <w:p>
+      <w:pPr>
+        <w:pStyle w:val="ListParagraph"/>
+        <w:numPr>
+          <w:ilvl w:val="1"/>
+          <w:numId w:val="1"/>
+        </w:numPr>
+        <w:bidi/>
+        <w:rPr>
+          <w:rFonts w:cs="B Nazanin"/>
+          <w:sz w:val="28"/>
+          <w:szCs w:val="28"/>
+          <w:lang w:bidi="fa-IR"/>
+        </w:rPr>
+      </w:pPr>
+      <w:r>
+        <w:rPr>
+          <w:rFonts w:cs="B Nazanin" w:hint="cs"/>
+          <w:sz w:val="28"/>
+          <w:szCs w:val="28"/>
+          <w:rtl/>
+          <w:lang w:bidi="fa-IR"/>
+        </w:rPr>
+        <w:t xml:space="preserve">یه نمونه از </w:t>
+      </w:r>
+      <w:r>
+        <w:rPr>
+          <w:rFonts w:cs="B Nazanin"/>
+          <w:sz w:val="28"/>
+          <w:szCs w:val="28"/>
+          <w:lang w:bidi="fa-IR"/>
+        </w:rPr>
+        <w:t>class diagram</w:t>
+      </w:r>
+      <w:r>
+        <w:rPr>
+          <w:rFonts w:cs="B Nazanin" w:hint="cs"/>
+          <w:sz w:val="28"/>
+          <w:szCs w:val="28"/>
+          <w:rtl/>
+          <w:lang w:bidi="fa-IR"/>
+        </w:rPr>
+        <w:t xml:space="preserve"> این پترن رو ببینیم</w:t>
+      </w:r>
+      <w:r>
+        <w:rPr>
+          <w:rFonts w:cs="B Nazanin" w:hint="cs"/>
+          <w:sz w:val="28"/>
+          <w:szCs w:val="28"/>
+          <w:rtl/>
+          <w:lang w:bidi="fa-IR"/>
+        </w:rPr>
+        <w:t>:</w:t>
+      </w:r>
+      <w:r>
+        <w:rPr>
+          <w:rFonts w:cs="B Nazanin"/>
+          <w:sz w:val="28"/>
+          <w:szCs w:val="28"/>
+          <w:rtl/>
+          <w:lang w:bidi="fa-IR"/>
+        </w:rPr>
+        <w:br/>
+      </w:r>
+      <w:r>
+        <w:rPr>
+          <w:rFonts w:cs="B Nazanin"/>
+          <w:noProof/>
+          <w:sz w:val="28"/>
+          <w:szCs w:val="28"/>
+          <w:lang w:bidi="fa-IR"/>
+        </w:rPr>
+        <w:drawing>
+          <wp:inline distT="0" distB="0" distL="0" distR="0" wp14:anchorId="40DE3D30" wp14:editId="77141E3D">
+            <wp:extent cx="5943600" cy="3305175"/>
+            <wp:effectExtent l="0" t="0" r="0" b="0"/>
+            <wp:docPr id="1165846503" name="Picture 4"/>
+            <wp:cNvGraphicFramePr>
+              <a:graphicFrameLocks xmlns:a="http://schemas.openxmlformats.org/drawingml/2006/main" noChangeAspect="1"/>
+            </wp:cNvGraphicFramePr>
+            <a:graphic xmlns:a="http://schemas.openxmlformats.org/drawingml/2006/main">
+              <a:graphicData uri="http://schemas.openxmlformats.org/drawingml/2006/picture">
+                <pic:pic xmlns:pic="http://schemas.openxmlformats.org/drawingml/2006/picture">
+                  <pic:nvPicPr>
+                    <pic:cNvPr id="1165846503" name="Picture 1165846503"/>
+                    <pic:cNvPicPr/>
+                  </pic:nvPicPr>
+                  <pic:blipFill>
+                    <a:blip r:embed="rId6" cstate="print">
+                      <a:extLst>
+                        <a:ext uri="{28A0092B-C50C-407E-A947-70E740481C1C}">
+                          <a14:useLocalDpi xmlns:a14="http://schemas.microsoft.com/office/drawing/2010/main" val="0"/>
+                        </a:ext>
+                      </a:extLst>
+                    </a:blip>
+                    <a:stretch>
+                      <a:fillRect/>
+                    </a:stretch>
+                  </pic:blipFill>
+                  <pic:spPr>
+                    <a:xfrm>
+                      <a:off x="0" y="0"/>
+                      <a:ext cx="5943600" cy="3305175"/>
+                    </a:xfrm>
+                    <a:prstGeom prst="rect">
+                      <a:avLst/>
+                    </a:prstGeom>
+                  </pic:spPr>
+                </pic:pic>
+              </a:graphicData>
+            </a:graphic>
+          </wp:inline>
+        </w:drawing>
+      </w:r>
+    </w:p>
+    <w:p>
+      <w:pPr>
+        <w:rPr>
+          <w:rFonts w:cs="B Nazanin"/>
+          <w:sz w:val="28"/>
+          <w:szCs w:val="28"/>
+          <w:rtl/>
+          <w:lang w:bidi="fa-IR"/>
+        </w:rPr>
+      </w:pPr>
+      <w:r>
+        <w:rPr>
+          <w:rFonts w:cs="Times New Roman"/>
+          <w:sz w:val="28"/>
+          <w:szCs w:val="28"/>
+          <w:rtl/>
+          <w:lang w:bidi="fa-IR"/>
+        </w:rPr>
+        <w:br w:type="page"/>
+      </w:r>
+    </w:p>
+    <w:p>
+      <w:pPr>
+        <w:pStyle w:val="ListParagraph"/>
+        <w:numPr>
+          <w:ilvl w:val="1"/>
+          <w:numId w:val="1"/>
+        </w:numPr>
+        <w:bidi/>
+        <w:rPr>
+          <w:rFonts w:cs="B Nazanin"/>
+          <w:sz w:val="28"/>
+          <w:szCs w:val="28"/>
+          <w:lang w:bidi="fa-IR"/>
+        </w:rPr>
+      </w:pPr>
+      <w:r>
+        <w:rPr>
+          <w:rFonts w:cs="B Nazanin" w:hint="cs"/>
+          <w:sz w:val="28"/>
+          <w:szCs w:val="28"/>
+          <w:rtl/>
+          <w:lang w:bidi="fa-IR"/>
+        </w:rPr>
+        <w:lastRenderedPageBreak/>
+        <w:t>مزایا:</w:t>
+      </w:r>
+      <w:r>
+        <w:rPr>
+          <w:rFonts w:cs="B Nazanin" w:hint="cs"/>
+          <w:sz w:val="28"/>
+          <w:szCs w:val="28"/>
+          <w:rtl/>
+          <w:lang w:bidi="fa-IR"/>
+        </w:rPr>
+        <w:t xml:space="preserve"> مشابه با </w:t>
+      </w:r>
+      <w:r>
+        <w:rPr>
+          <w:rFonts w:cs="B Nazanin"/>
+          <w:sz w:val="28"/>
+          <w:szCs w:val="28"/>
+          <w:lang w:bidi="fa-IR"/>
+        </w:rPr>
+        <w:t>FactoryMethod</w:t>
+      </w:r>
+      <w:r>
+        <w:rPr>
+          <w:rFonts w:cs="B Nazanin" w:hint="cs"/>
+          <w:sz w:val="28"/>
+          <w:szCs w:val="28"/>
+          <w:rtl/>
+          <w:lang w:bidi="fa-IR"/>
+        </w:rPr>
+        <w:t xml:space="preserve"> ئه. یکی بحث </w:t>
+      </w:r>
+      <w:r>
+        <w:rPr>
+          <w:rFonts w:cs="B Nazanin"/>
+          <w:sz w:val="28"/>
+          <w:szCs w:val="28"/>
+          <w:lang w:bidi="fa-IR"/>
+        </w:rPr>
+        <w:t>separation of concern</w:t>
+      </w:r>
+      <w:r>
+        <w:rPr>
+          <w:rFonts w:cs="B Nazanin" w:hint="cs"/>
+          <w:sz w:val="28"/>
+          <w:szCs w:val="28"/>
+          <w:rtl/>
+          <w:lang w:bidi="fa-IR"/>
+        </w:rPr>
+        <w:t xml:space="preserve"> هست که </w:t>
+      </w:r>
+      <w:r>
+        <w:rPr>
+          <w:rFonts w:cs="B Nazanin" w:hint="cs"/>
+          <w:sz w:val="28"/>
+          <w:szCs w:val="28"/>
+          <w:rtl/>
+          <w:lang w:bidi="fa-IR"/>
+        </w:rPr>
+        <w:t xml:space="preserve">نحوه و وظیفه ایجاد </w:t>
+      </w:r>
+      <w:r>
+        <w:rPr>
+          <w:rFonts w:cs="B Nazanin"/>
+          <w:sz w:val="28"/>
+          <w:szCs w:val="28"/>
+          <w:lang w:bidi="fa-IR"/>
+        </w:rPr>
+        <w:t>Product</w:t>
+      </w:r>
+      <w:r>
+        <w:rPr>
+          <w:rFonts w:cs="B Nazanin" w:hint="cs"/>
+          <w:sz w:val="28"/>
+          <w:szCs w:val="28"/>
+          <w:rtl/>
+          <w:lang w:bidi="fa-IR"/>
+        </w:rPr>
+        <w:t xml:space="preserve"> ها دیگه با </w:t>
+      </w:r>
+      <w:r>
+        <w:rPr>
+          <w:rFonts w:cs="B Nazanin"/>
+          <w:sz w:val="28"/>
+          <w:szCs w:val="28"/>
+          <w:lang w:bidi="fa-IR"/>
+        </w:rPr>
+        <w:t>client</w:t>
+      </w:r>
+      <w:r>
+        <w:rPr>
+          <w:rFonts w:cs="B Nazanin" w:hint="cs"/>
+          <w:sz w:val="28"/>
+          <w:szCs w:val="28"/>
+          <w:rtl/>
+          <w:lang w:bidi="fa-IR"/>
+        </w:rPr>
+        <w:t xml:space="preserve"> نیست.</w:t>
+      </w:r>
+      <w:r>
+        <w:rPr>
+          <w:rFonts w:cs="B Nazanin" w:hint="cs"/>
+          <w:sz w:val="28"/>
+          <w:szCs w:val="28"/>
+          <w:rtl/>
+          <w:lang w:bidi="fa-IR"/>
+        </w:rPr>
+        <w:t xml:space="preserve"> مزیت بعدی انعطاف پذیری کد هست که هر زمان بخوایم،‌ میتونیم یه </w:t>
+      </w:r>
+      <w:r>
+        <w:rPr>
+          <w:rFonts w:cs="B Nazanin"/>
+          <w:sz w:val="28"/>
+          <w:szCs w:val="28"/>
+          <w:lang w:bidi="fa-IR"/>
+        </w:rPr>
+        <w:t>concreteFactory</w:t>
+      </w:r>
+      <w:r>
+        <w:rPr>
+          <w:rFonts w:cs="B Nazanin" w:hint="cs"/>
+          <w:sz w:val="28"/>
+          <w:szCs w:val="28"/>
+          <w:rtl/>
+          <w:lang w:bidi="fa-IR"/>
+        </w:rPr>
+        <w:t xml:space="preserve"> دیگه یا حتی </w:t>
+      </w:r>
+      <w:r>
+        <w:rPr>
+          <w:rFonts w:cs="B Nazanin"/>
+          <w:sz w:val="28"/>
+          <w:szCs w:val="28"/>
+          <w:lang w:bidi="fa-IR"/>
+        </w:rPr>
+        <w:t>Product</w:t>
+      </w:r>
+      <w:r>
+        <w:rPr>
+          <w:rFonts w:cs="B Nazanin" w:hint="cs"/>
+          <w:sz w:val="28"/>
+          <w:szCs w:val="28"/>
+          <w:rtl/>
+          <w:lang w:bidi="fa-IR"/>
+        </w:rPr>
+        <w:t xml:space="preserve"> های دیگه اضافه کنیم و این اضافه کردن هم به راحتی انجام میشه هم کد های قبلی رو درگیر نمیکنه</w:t>
+      </w:r>
+      <w:r>
+        <w:rPr>
+          <w:rFonts w:cs="B Nazanin" w:hint="cs"/>
+          <w:sz w:val="28"/>
+          <w:szCs w:val="28"/>
+          <w:rtl/>
+          <w:lang w:bidi="fa-IR"/>
+        </w:rPr>
+        <w:t>.</w:t>
+      </w:r>
+      <w:r>
+        <w:rPr>
+          <w:rFonts w:cs="B Nazanin" w:hint="cs"/>
+          <w:sz w:val="28"/>
+          <w:szCs w:val="28"/>
+          <w:rtl/>
+          <w:lang w:bidi="fa-IR"/>
+        </w:rPr>
+        <w:t xml:space="preserve"> در نهایت این رو هم داره که </w:t>
+      </w:r>
+      <w:r>
+        <w:rPr>
+          <w:rFonts w:cs="B Nazanin"/>
+          <w:sz w:val="28"/>
+          <w:szCs w:val="28"/>
+          <w:lang w:bidi="fa-IR"/>
+        </w:rPr>
+        <w:t>client</w:t>
+      </w:r>
+      <w:r>
+        <w:rPr>
+          <w:rFonts w:cs="B Nazanin" w:hint="cs"/>
+          <w:sz w:val="28"/>
+          <w:szCs w:val="28"/>
+          <w:rtl/>
+          <w:lang w:bidi="fa-IR"/>
+        </w:rPr>
+        <w:t xml:space="preserve"> خیالش راحته که هیچ مجموعه ای از </w:t>
+      </w:r>
+      <w:r>
+        <w:rPr>
+          <w:rFonts w:cs="B Nazanin"/>
+          <w:sz w:val="28"/>
+          <w:szCs w:val="28"/>
+          <w:lang w:bidi="fa-IR"/>
+        </w:rPr>
+        <w:t>Product</w:t>
+      </w:r>
+      <w:r>
+        <w:rPr>
+          <w:rFonts w:cs="B Nazanin" w:hint="cs"/>
+          <w:sz w:val="28"/>
+          <w:szCs w:val="28"/>
+          <w:rtl/>
+          <w:lang w:bidi="fa-IR"/>
+        </w:rPr>
+        <w:t xml:space="preserve"> های مختلف که به هم ربط ندارن با هم ترکیب نمیشن.</w:t>
+      </w:r>
+      <w:r>
+        <w:rPr>
+          <w:rFonts w:cs="B Nazanin" w:hint="cs"/>
+          <w:sz w:val="28"/>
+          <w:szCs w:val="28"/>
+          <w:rtl/>
+          <w:lang w:bidi="fa-IR"/>
+        </w:rPr>
+        <w:t xml:space="preserve"> اصول </w:t>
+      </w:r>
+      <w:r>
+        <w:rPr>
+          <w:rFonts w:cs="B Nazanin"/>
+          <w:sz w:val="28"/>
+          <w:szCs w:val="28"/>
+          <w:lang w:bidi="fa-IR"/>
+        </w:rPr>
+        <w:t>Single responsibility</w:t>
+      </w:r>
+      <w:r>
+        <w:rPr>
+          <w:rFonts w:cs="B Nazanin" w:hint="cs"/>
+          <w:sz w:val="28"/>
+          <w:szCs w:val="28"/>
+          <w:rtl/>
+          <w:lang w:bidi="fa-IR"/>
+        </w:rPr>
+        <w:t xml:space="preserve"> و </w:t>
+      </w:r>
+      <w:r>
+        <w:rPr>
+          <w:rFonts w:cs="B Nazanin"/>
+          <w:sz w:val="28"/>
+          <w:szCs w:val="28"/>
+          <w:lang w:bidi="fa-IR"/>
+        </w:rPr>
+        <w:t>open/closed</w:t>
+      </w:r>
+      <w:r>
+        <w:rPr>
+          <w:rFonts w:cs="B Nazanin" w:hint="cs"/>
+          <w:sz w:val="28"/>
+          <w:szCs w:val="28"/>
+          <w:rtl/>
+          <w:lang w:bidi="fa-IR"/>
+        </w:rPr>
+        <w:t xml:space="preserve"> هم رعایت میشن.</w:t>
+      </w:r>
+    </w:p>
+    <w:p>
+      <w:pPr>
+        <w:pStyle w:val="ListParagraph"/>
+        <w:rPr>
+          <w:rFonts w:cs="B Nazanin" w:hint="cs"/>
+          <w:sz w:val="28"/>
+          <w:szCs w:val="28"/>
+          <w:rtl/>
+          <w:lang w:bidi="fa-IR"/>
+        </w:rPr>
+      </w:pPr>
+    </w:p>
+    <w:p>
+      <w:pPr>
+        <w:pStyle w:val="ListParagraph"/>
+        <w:numPr>
+          <w:ilvl w:val="1"/>
+          <w:numId w:val="1"/>
+        </w:numPr>
+        <w:bidi/>
+        <w:rPr>
+          <w:rFonts w:cs="B Nazanin"/>
+          <w:sz w:val="28"/>
+          <w:szCs w:val="28"/>
+          <w:lang w:bidi="fa-IR"/>
+        </w:rPr>
+      </w:pPr>
+      <w:r>
+        <w:rPr>
+          <w:rFonts w:cs="B Nazanin" w:hint="cs"/>
+          <w:sz w:val="28"/>
+          <w:szCs w:val="28"/>
+          <w:rtl/>
+          <w:lang w:bidi="fa-IR"/>
+        </w:rPr>
+        <w:t>معایب:</w:t>
+      </w:r>
+      <w:r>
+        <w:rPr>
+          <w:rFonts w:cs="B Nazanin" w:hint="cs"/>
+          <w:sz w:val="28"/>
+          <w:szCs w:val="28"/>
+          <w:rtl/>
+          <w:lang w:bidi="fa-IR"/>
+        </w:rPr>
+        <w:t xml:space="preserve"> پیچیدگی و حجم کد بالا میره و به مرور زمان اگه این بخش زیادی بزرگ بشه، </w:t>
+      </w:r>
+      <w:r>
+        <w:rPr>
+          <w:rFonts w:cs="B Nazanin"/>
+          <w:sz w:val="28"/>
+          <w:szCs w:val="28"/>
+          <w:lang w:bidi="fa-IR"/>
+        </w:rPr>
+        <w:t>trace</w:t>
+      </w:r>
+      <w:r>
+        <w:rPr>
+          <w:rFonts w:cs="B Nazanin" w:hint="cs"/>
+          <w:sz w:val="28"/>
+          <w:szCs w:val="28"/>
+          <w:rtl/>
+          <w:lang w:bidi="fa-IR"/>
+        </w:rPr>
+        <w:t xml:space="preserve"> کردن کد میتونه اذیت کننده باشه چون ما داریم سمت </w:t>
+      </w:r>
+      <w:r>
+        <w:rPr>
+          <w:rFonts w:cs="B Nazanin"/>
+          <w:sz w:val="28"/>
+          <w:szCs w:val="28"/>
+          <w:lang w:bidi="fa-IR"/>
+        </w:rPr>
+        <w:t>client</w:t>
+      </w:r>
+      <w:r>
+        <w:rPr>
+          <w:rFonts w:cs="B Nazanin" w:hint="cs"/>
+          <w:sz w:val="28"/>
+          <w:szCs w:val="28"/>
+          <w:rtl/>
+          <w:lang w:bidi="fa-IR"/>
+        </w:rPr>
+        <w:t xml:space="preserve"> به صورت غیر مستقیم از هر لایه میسازیم و خیلی در نگاه اول واضح نیست که کدوم لایه خاص استفاده شده. درنتیجه دائما باید بین کد های متخلف جابجا بشیم و این، کار </w:t>
+      </w:r>
+      <w:r>
+        <w:rPr>
+          <w:rFonts w:cs="B Nazanin"/>
+          <w:sz w:val="28"/>
+          <w:szCs w:val="28"/>
+          <w:lang w:bidi="fa-IR"/>
+        </w:rPr>
+        <w:t>trace</w:t>
+      </w:r>
+      <w:r>
+        <w:rPr>
+          <w:rFonts w:cs="B Nazanin" w:hint="cs"/>
+          <w:sz w:val="28"/>
+          <w:szCs w:val="28"/>
+          <w:rtl/>
+          <w:lang w:bidi="fa-IR"/>
+        </w:rPr>
+        <w:t xml:space="preserve"> رو سخت میکنه.</w:t>
+      </w:r>
+      <w:r>
+        <w:rPr>
+          <w:rFonts w:cs="B Nazanin" w:hint="cs"/>
+          <w:sz w:val="28"/>
+          <w:szCs w:val="28"/>
+          <w:rtl/>
+          <w:lang w:bidi="fa-IR"/>
+        </w:rPr>
+        <w:t xml:space="preserve"> پس باید حواسمون باشه که این پیچیدگی بیشتر در مقایسه با </w:t>
+      </w:r>
+      <w:r>
+        <w:rPr>
+          <w:rFonts w:cs="B Nazanin"/>
+          <w:sz w:val="28"/>
+          <w:szCs w:val="28"/>
+          <w:lang w:bidi="fa-IR"/>
+        </w:rPr>
+        <w:t>decoupling</w:t>
+      </w:r>
+      <w:r>
+        <w:rPr>
+          <w:rFonts w:cs="B Nazanin" w:hint="cs"/>
+          <w:sz w:val="28"/>
+          <w:szCs w:val="28"/>
+          <w:rtl/>
+          <w:lang w:bidi="fa-IR"/>
+        </w:rPr>
+        <w:t xml:space="preserve"> و مزایای دیگه ای که ایجاد میشه می ارزه یا نه</w:t>
+      </w:r>
+      <w:r>
+        <w:rPr>
+          <w:rFonts w:cs="B Nazanin" w:hint="cs"/>
+          <w:sz w:val="28"/>
+          <w:szCs w:val="28"/>
+          <w:rtl/>
+          <w:lang w:bidi="fa-IR"/>
+        </w:rPr>
+        <w:t>.</w:t>
+      </w:r>
+      <w:r>
+        <w:rPr>
+          <w:rFonts w:cs="B Nazanin"/>
+          <w:sz w:val="28"/>
+          <w:szCs w:val="28"/>
+          <w:rtl/>
+          <w:lang w:bidi="fa-IR"/>
+        </w:rPr>
+        <w:br/>
+      </w:r>
+      <w:r>
+        <w:rPr>
+          <w:rFonts w:cs="B Nazanin" w:hint="cs"/>
+          <w:sz w:val="28"/>
+          <w:szCs w:val="28"/>
+          <w:rtl/>
+          <w:lang w:bidi="fa-IR"/>
+        </w:rPr>
+        <w:t xml:space="preserve">عیب بعدی که در عین حال مزیت هم هست،‌ اینه که ما تعداد زیادی کلاس و اینترفیس داریم که </w:t>
+      </w:r>
+      <w:r>
+        <w:rPr>
+          <w:rFonts w:cs="B Nazanin"/>
+          <w:sz w:val="28"/>
+          <w:szCs w:val="28"/>
+          <w:lang w:bidi="fa-IR"/>
+        </w:rPr>
+        <w:t>maintain</w:t>
+      </w:r>
+      <w:r>
+        <w:rPr>
+          <w:rFonts w:cs="B Nazanin" w:hint="cs"/>
+          <w:sz w:val="28"/>
+          <w:szCs w:val="28"/>
+          <w:rtl/>
+          <w:lang w:bidi="fa-IR"/>
+        </w:rPr>
+        <w:t xml:space="preserve"> کردن کد و </w:t>
+      </w:r>
+      <w:r>
+        <w:rPr>
+          <w:rFonts w:cs="B Nazanin"/>
+          <w:sz w:val="28"/>
+          <w:szCs w:val="28"/>
+          <w:lang w:bidi="fa-IR"/>
+        </w:rPr>
+        <w:t>test</w:t>
+      </w:r>
+      <w:r>
+        <w:rPr>
+          <w:rFonts w:cs="B Nazanin" w:hint="cs"/>
+          <w:sz w:val="28"/>
+          <w:szCs w:val="28"/>
+          <w:rtl/>
+          <w:lang w:bidi="fa-IR"/>
+        </w:rPr>
+        <w:t xml:space="preserve"> اون رو سخت تر میکنه. اما در عین حال به خاطر </w:t>
+      </w:r>
+      <w:r>
+        <w:rPr>
+          <w:rFonts w:cs="B Nazanin"/>
+          <w:sz w:val="28"/>
+          <w:szCs w:val="28"/>
+          <w:lang w:bidi="fa-IR"/>
+        </w:rPr>
+        <w:t>modularity</w:t>
+      </w:r>
+      <w:r>
+        <w:rPr>
+          <w:rFonts w:cs="B Nazanin" w:hint="cs"/>
+          <w:sz w:val="28"/>
+          <w:szCs w:val="28"/>
+          <w:rtl/>
+          <w:lang w:bidi="fa-IR"/>
+        </w:rPr>
+        <w:t xml:space="preserve"> ای که بهش اضافه کردیم، </w:t>
+      </w:r>
+      <w:r>
+        <w:rPr>
+          <w:rFonts w:cs="B Nazanin"/>
+          <w:sz w:val="28"/>
+          <w:szCs w:val="28"/>
+          <w:lang w:bidi="fa-IR"/>
+        </w:rPr>
+        <w:t>maintain</w:t>
+      </w:r>
+      <w:r>
+        <w:rPr>
+          <w:rFonts w:cs="B Nazanin" w:hint="cs"/>
+          <w:sz w:val="28"/>
+          <w:szCs w:val="28"/>
+          <w:rtl/>
+          <w:lang w:bidi="fa-IR"/>
+        </w:rPr>
+        <w:t xml:space="preserve"> و </w:t>
+      </w:r>
+      <w:r>
+        <w:rPr>
+          <w:rFonts w:cs="B Nazanin"/>
+          <w:sz w:val="28"/>
+          <w:szCs w:val="28"/>
+          <w:lang w:bidi="fa-IR"/>
+        </w:rPr>
+        <w:t>test</w:t>
+      </w:r>
+      <w:r>
+        <w:rPr>
+          <w:rFonts w:cs="B Nazanin" w:hint="cs"/>
+          <w:sz w:val="28"/>
+          <w:szCs w:val="28"/>
+          <w:rtl/>
+          <w:lang w:bidi="fa-IR"/>
+        </w:rPr>
+        <w:t xml:space="preserve"> بخش هایی که از این پترن توشون استفاده شده به مراتب راحتتره.</w:t>
+      </w:r>
+      <w:r>
+        <w:rPr>
+          <w:rFonts w:cs="B Nazanin"/>
+          <w:sz w:val="28"/>
+          <w:szCs w:val="28"/>
+          <w:rtl/>
+          <w:lang w:bidi="fa-IR"/>
+        </w:rPr>
+        <w:br/>
+      </w:r>
+    </w:p>
+    <w:p>
+      <w:pPr>
+        <w:rPr>
+          <w:rFonts w:cs="B Nazanin"/>
+          <w:sz w:val="28"/>
+          <w:szCs w:val="28"/>
+          <w:lang w:bidi="fa-IR"/>
+        </w:rPr>
+      </w:pPr>
+      <w:r>
+        <w:rPr>
+          <w:rFonts w:cs="B Nazanin"/>
+          <w:sz w:val="28"/>
+          <w:szCs w:val="28"/>
+          <w:lang w:bidi="fa-IR"/>
+        </w:rPr>
+        <w:br w:type="page"/>
+      </w:r>
+    </w:p>
+    <w:p>
+      <w:pPr>
+        <w:pStyle w:val="ListParagraph"/>
+        <w:numPr>
+          <w:ilvl w:val="0"/>
+          <w:numId w:val="1"/>
+        </w:numPr>
+        <w:bidi/>
+        <w:rPr>
+          <w:rFonts w:cs="B Nazanin"/>
+          <w:sz w:val="28"/>
+          <w:szCs w:val="28"/>
+          <w:lang w:bidi="fa-IR"/>
+        </w:rPr>
+      </w:pPr>
+      <w:r>
+        <w:rPr>
+          <w:rFonts w:cs="B Nazanin"/>
+          <w:sz w:val="28"/>
+          <w:szCs w:val="28"/>
+          <w:lang w:bidi="fa-IR"/>
+        </w:rPr>
+        <w:lastRenderedPageBreak/>
+        <w:t>Singleton</w:t>
+      </w:r>
+      <w:r>
+        <w:rPr>
+          <w:rFonts w:cs="B Nazanin" w:hint="cs"/>
+          <w:sz w:val="28"/>
+          <w:szCs w:val="28"/>
+          <w:rtl/>
+          <w:lang w:bidi="fa-IR"/>
+        </w:rPr>
+        <w:t>؟</w:t>
+      </w:r>
+    </w:p>
+    <w:p>
+      <w:pPr>
+        <w:pStyle w:val="ListParagraph"/>
+        <w:numPr>
+          <w:ilvl w:val="1"/>
+          <w:numId w:val="1"/>
+        </w:numPr>
+        <w:bidi/>
+        <w:rPr>
+          <w:rFonts w:cs="B Nazanin"/>
+          <w:sz w:val="28"/>
+          <w:szCs w:val="28"/>
+          <w:lang w:bidi="fa-IR"/>
+        </w:rPr>
+      </w:pPr>
+      <w:r>
+        <w:rPr>
+          <w:rFonts w:cs="B Nazanin" w:hint="cs"/>
+          <w:sz w:val="28"/>
+          <w:szCs w:val="28"/>
+          <w:rtl/>
+          <w:lang w:bidi="fa-IR"/>
+        </w:rPr>
+        <w:t xml:space="preserve">یه </w:t>
+      </w:r>
+      <w:r>
+        <w:rPr>
+          <w:rFonts w:cs="B Nazanin"/>
+          <w:sz w:val="28"/>
+          <w:szCs w:val="28"/>
+          <w:lang w:bidi="fa-IR"/>
+        </w:rPr>
+        <w:t>creational pattern</w:t>
+      </w:r>
+      <w:r>
+        <w:rPr>
+          <w:rFonts w:cs="B Nazanin" w:hint="cs"/>
+          <w:sz w:val="28"/>
+          <w:szCs w:val="28"/>
+          <w:rtl/>
+          <w:lang w:bidi="fa-IR"/>
+        </w:rPr>
+        <w:t xml:space="preserve"> هست که </w:t>
+      </w:r>
+      <w:r>
+        <w:rPr>
+          <w:rFonts w:cs="B Nazanin" w:hint="cs"/>
+          <w:sz w:val="28"/>
+          <w:szCs w:val="28"/>
+          <w:rtl/>
+          <w:lang w:bidi="fa-IR"/>
+        </w:rPr>
+        <w:t xml:space="preserve">برای ساخت </w:t>
+      </w:r>
+      <w:r>
+        <w:rPr>
+          <w:rFonts w:cs="B Nazanin"/>
+          <w:sz w:val="28"/>
+          <w:szCs w:val="28"/>
+          <w:lang w:bidi="fa-IR"/>
+        </w:rPr>
+        <w:t>instance</w:t>
+      </w:r>
+      <w:r>
+        <w:rPr>
+          <w:rFonts w:cs="B Nazanin" w:hint="cs"/>
+          <w:sz w:val="28"/>
+          <w:szCs w:val="28"/>
+          <w:rtl/>
+          <w:lang w:bidi="fa-IR"/>
+        </w:rPr>
+        <w:t xml:space="preserve"> از کلاس هایی استفاده میشه که میخوایم در طول اجرای برنامه فقط یه </w:t>
+      </w:r>
+      <w:r>
+        <w:rPr>
+          <w:rFonts w:cs="B Nazanin"/>
+          <w:sz w:val="28"/>
+          <w:szCs w:val="28"/>
+          <w:lang w:bidi="fa-IR"/>
+        </w:rPr>
+        <w:t>instance</w:t>
+      </w:r>
+      <w:r>
+        <w:rPr>
+          <w:rFonts w:cs="B Nazanin" w:hint="cs"/>
+          <w:sz w:val="28"/>
+          <w:szCs w:val="28"/>
+          <w:rtl/>
+          <w:lang w:bidi="fa-IR"/>
+        </w:rPr>
+        <w:t xml:space="preserve"> از اون کلاس رو داشته باشیم. برای نمونه، هر برنامه ای نیاز به یه </w:t>
+      </w:r>
+      <w:r>
+        <w:rPr>
+          <w:rFonts w:cs="B Nazanin"/>
+          <w:sz w:val="28"/>
+          <w:szCs w:val="28"/>
+          <w:lang w:bidi="fa-IR"/>
+        </w:rPr>
+        <w:t>logger</w:t>
+      </w:r>
+      <w:r>
+        <w:rPr>
+          <w:rFonts w:cs="B Nazanin" w:hint="cs"/>
+          <w:sz w:val="28"/>
+          <w:szCs w:val="28"/>
+          <w:rtl/>
+          <w:lang w:bidi="fa-IR"/>
+        </w:rPr>
+        <w:t xml:space="preserve"> داره که برای قسمت های مختلف برنامه </w:t>
+      </w:r>
+      <w:r>
+        <w:rPr>
+          <w:rFonts w:cs="B Nazanin"/>
+          <w:sz w:val="28"/>
+          <w:szCs w:val="28"/>
+          <w:lang w:bidi="fa-IR"/>
+        </w:rPr>
+        <w:t>log</w:t>
+      </w:r>
+      <w:r>
+        <w:rPr>
+          <w:rFonts w:cs="B Nazanin" w:hint="cs"/>
+          <w:sz w:val="28"/>
+          <w:szCs w:val="28"/>
+          <w:rtl/>
+          <w:lang w:bidi="fa-IR"/>
+        </w:rPr>
+        <w:t xml:space="preserve"> بندازه. زمانیکه میخوایم </w:t>
+      </w:r>
+      <w:r>
+        <w:rPr>
+          <w:rFonts w:cs="B Nazanin"/>
+          <w:sz w:val="28"/>
+          <w:szCs w:val="28"/>
+          <w:lang w:bidi="fa-IR"/>
+        </w:rPr>
+        <w:t>logger</w:t>
+      </w:r>
+      <w:r>
+        <w:rPr>
+          <w:rFonts w:cs="B Nazanin" w:hint="cs"/>
+          <w:sz w:val="28"/>
+          <w:szCs w:val="28"/>
+          <w:rtl/>
+          <w:lang w:bidi="fa-IR"/>
+        </w:rPr>
+        <w:t xml:space="preserve"> رو </w:t>
+      </w:r>
+      <w:r>
+        <w:rPr>
+          <w:rFonts w:cs="B Nazanin"/>
+          <w:sz w:val="28"/>
+          <w:szCs w:val="28"/>
+          <w:lang w:bidi="fa-IR"/>
+        </w:rPr>
+        <w:t>new</w:t>
+      </w:r>
+      <w:r>
+        <w:rPr>
+          <w:rFonts w:cs="B Nazanin" w:hint="cs"/>
+          <w:sz w:val="28"/>
+          <w:szCs w:val="28"/>
+          <w:rtl/>
+          <w:lang w:bidi="fa-IR"/>
+        </w:rPr>
+        <w:t xml:space="preserve"> کنیم، چیزایی مثل زمان شروع اجرای برنامه (که خب معمولا بعد از اجرای برنامه با یه </w:t>
+      </w:r>
+      <w:r>
+        <w:rPr>
+          <w:rFonts w:cs="B Nazanin"/>
+          <w:sz w:val="28"/>
+          <w:szCs w:val="28"/>
+          <w:lang w:bidi="fa-IR"/>
+        </w:rPr>
+        <w:t>Datetime.Now</w:t>
+      </w:r>
+      <w:r>
+        <w:rPr>
+          <w:rFonts w:cs="B Nazanin" w:hint="cs"/>
+          <w:sz w:val="28"/>
+          <w:szCs w:val="28"/>
+          <w:rtl/>
+          <w:lang w:bidi="fa-IR"/>
+        </w:rPr>
+        <w:t xml:space="preserve"> مقداردهی میشه) رو داریم براش تعیین می کنیم؛ اگه این کلاس قرار باشه با هر بار </w:t>
+      </w:r>
+      <w:r>
+        <w:rPr>
+          <w:rFonts w:cs="B Nazanin"/>
+          <w:sz w:val="28"/>
+          <w:szCs w:val="28"/>
+          <w:lang w:bidi="fa-IR"/>
+        </w:rPr>
+        <w:t>new</w:t>
+      </w:r>
+      <w:r>
+        <w:rPr>
+          <w:rFonts w:cs="B Nazanin" w:hint="cs"/>
+          <w:sz w:val="28"/>
+          <w:szCs w:val="28"/>
+          <w:rtl/>
+          <w:lang w:bidi="fa-IR"/>
+        </w:rPr>
+        <w:t xml:space="preserve"> کردن اش زمان شروع اجرای برنامه </w:t>
+      </w:r>
+      <w:r>
+        <w:rPr>
+          <w:rFonts w:cs="B Nazanin" w:hint="cs"/>
+          <w:sz w:val="28"/>
+          <w:szCs w:val="28"/>
+          <w:rtl/>
+          <w:lang w:bidi="fa-IR"/>
+        </w:rPr>
+        <w:t xml:space="preserve">رو برای هر </w:t>
+      </w:r>
+      <w:r>
+        <w:rPr>
+          <w:rFonts w:cs="B Nazanin"/>
+          <w:sz w:val="28"/>
+          <w:szCs w:val="28"/>
+          <w:lang w:bidi="fa-IR"/>
+        </w:rPr>
+        <w:t>instance</w:t>
+      </w:r>
+      <w:r>
+        <w:rPr>
+          <w:rFonts w:cs="B Nazanin" w:hint="cs"/>
+          <w:sz w:val="28"/>
+          <w:szCs w:val="28"/>
+          <w:rtl/>
+          <w:lang w:bidi="fa-IR"/>
+        </w:rPr>
+        <w:t xml:space="preserve"> اش تغییر بده، دیگه اون زمان </w:t>
+      </w:r>
+      <w:r>
+        <w:rPr>
+          <w:rFonts w:cs="B Nazanin"/>
+          <w:sz w:val="28"/>
+          <w:szCs w:val="28"/>
+          <w:lang w:bidi="fa-IR"/>
+        </w:rPr>
+        <w:t>valid</w:t>
+      </w:r>
+      <w:r>
+        <w:rPr>
+          <w:rFonts w:cs="B Nazanin" w:hint="cs"/>
+          <w:sz w:val="28"/>
+          <w:szCs w:val="28"/>
+          <w:rtl/>
+          <w:lang w:bidi="fa-IR"/>
+        </w:rPr>
+        <w:t xml:space="preserve"> نیست. پس لازمه که از این کلاس، همیشه یه </w:t>
+      </w:r>
+      <w:r>
+        <w:rPr>
+          <w:rFonts w:cs="B Nazanin"/>
+          <w:sz w:val="28"/>
+          <w:szCs w:val="28"/>
+          <w:lang w:bidi="fa-IR"/>
+        </w:rPr>
+        <w:t>instance</w:t>
+      </w:r>
+      <w:r>
+        <w:rPr>
+          <w:rFonts w:cs="B Nazanin" w:hint="cs"/>
+          <w:sz w:val="28"/>
+          <w:szCs w:val="28"/>
+          <w:rtl/>
+          <w:lang w:bidi="fa-IR"/>
+        </w:rPr>
+        <w:t xml:space="preserve"> در کل برنامه در زمان اجراش داشته باشیم.</w:t>
+      </w:r>
+    </w:p>
+    <w:p>
+      <w:pPr>
+        <w:pStyle w:val="ListParagraph"/>
+        <w:numPr>
+          <w:ilvl w:val="1"/>
+          <w:numId w:val="1"/>
+        </w:numPr>
+        <w:bidi/>
+        <w:rPr>
+          <w:rFonts w:cs="B Nazanin"/>
+          <w:sz w:val="28"/>
+          <w:szCs w:val="28"/>
+          <w:lang w:bidi="fa-IR"/>
+        </w:rPr>
+      </w:pPr>
+      <w:r>
+        <w:rPr>
+          <w:rFonts w:cs="B Nazanin" w:hint="cs"/>
+          <w:sz w:val="28"/>
+          <w:szCs w:val="28"/>
+          <w:rtl/>
+          <w:lang w:bidi="fa-IR"/>
+        </w:rPr>
         <w:t>یه سری مشخصه ها این پترن داره که باید در زمان پیاده سازیش رعایتشون کنیم:</w:t>
       </w:r>
     </w:p>
@@ -2241,7 +3534,265 @@
           <w:rtl/>
           <w:lang w:bidi="fa-IR"/>
         </w:rPr>
-        <w:t xml:space="preserve"> اش کنیم، یهو </w:t>
+        <w:t xml:space="preserve"> اش کنیم، یهو تعداد زیادی </w:t>
+      </w:r>
+      <w:r>
+        <w:rPr>
+          <w:rFonts w:cs="B Nazanin"/>
+          <w:sz w:val="28"/>
+          <w:szCs w:val="28"/>
+          <w:lang w:bidi="fa-IR"/>
+        </w:rPr>
+        <w:t>thread</w:t>
+      </w:r>
+      <w:r>
+        <w:rPr>
+          <w:rFonts w:cs="B Nazanin" w:hint="cs"/>
+          <w:sz w:val="28"/>
+          <w:szCs w:val="28"/>
+          <w:rtl/>
+          <w:lang w:bidi="fa-IR"/>
+        </w:rPr>
+        <w:t xml:space="preserve"> میان و یکیشون وارد </w:t>
+      </w:r>
+      <w:r>
+        <w:rPr>
+          <w:rFonts w:cs="B Nazanin"/>
+          <w:sz w:val="28"/>
+          <w:szCs w:val="28"/>
+          <w:lang w:bidi="fa-IR"/>
+        </w:rPr>
+        <w:t>lock</w:t>
+      </w:r>
+      <w:r>
+        <w:rPr>
+          <w:rFonts w:cs="B Nazanin" w:hint="cs"/>
+          <w:sz w:val="28"/>
+          <w:szCs w:val="28"/>
+          <w:rtl/>
+          <w:lang w:bidi="fa-IR"/>
+        </w:rPr>
+        <w:t xml:space="preserve"> میشه. باقی </w:t>
+      </w:r>
+      <w:r>
+        <w:rPr>
+          <w:rFonts w:cs="B Nazanin"/>
+          <w:sz w:val="28"/>
+          <w:szCs w:val="28"/>
+          <w:lang w:bidi="fa-IR"/>
+        </w:rPr>
+        <w:t>thread</w:t>
+      </w:r>
+      <w:r>
+        <w:rPr>
+          <w:rFonts w:cs="B Nazanin" w:hint="cs"/>
+          <w:sz w:val="28"/>
+          <w:szCs w:val="28"/>
+          <w:rtl/>
+          <w:lang w:bidi="fa-IR"/>
+        </w:rPr>
+        <w:t xml:space="preserve"> ها پشت سرش می مونن تا این </w:t>
+      </w:r>
+      <w:r>
+        <w:rPr>
+          <w:rFonts w:cs="B Nazanin"/>
+          <w:sz w:val="28"/>
+          <w:szCs w:val="28"/>
+          <w:lang w:bidi="fa-IR"/>
+        </w:rPr>
+        <w:t>lock</w:t>
+      </w:r>
+      <w:r>
+        <w:rPr>
+          <w:rFonts w:cs="B Nazanin" w:hint="cs"/>
+          <w:sz w:val="28"/>
+          <w:szCs w:val="28"/>
+          <w:rtl/>
+          <w:lang w:bidi="fa-IR"/>
+        </w:rPr>
+        <w:t xml:space="preserve"> رو </w:t>
+      </w:r>
+      <w:r>
+        <w:rPr>
+          <w:rFonts w:cs="B Nazanin"/>
+          <w:sz w:val="28"/>
+          <w:szCs w:val="28"/>
+          <w:lang w:bidi="fa-IR"/>
+        </w:rPr>
+        <w:t>release</w:t>
+      </w:r>
+      <w:r>
+        <w:rPr>
+          <w:rFonts w:cs="B Nazanin" w:hint="cs"/>
+          <w:sz w:val="28"/>
+          <w:szCs w:val="28"/>
+          <w:rtl/>
+          <w:lang w:bidi="fa-IR"/>
+        </w:rPr>
+        <w:t xml:space="preserve"> کنه. در نتیجه به </w:t>
+      </w:r>
+      <w:r>
+        <w:rPr>
+          <w:rFonts w:cs="B Nazanin"/>
+          <w:sz w:val="28"/>
+          <w:szCs w:val="28"/>
+          <w:lang w:bidi="fa-IR"/>
+        </w:rPr>
+        <w:t>race condition</w:t>
+      </w:r>
+      <w:r>
+        <w:rPr>
+          <w:rFonts w:cs="B Nazanin" w:hint="cs"/>
+          <w:sz w:val="28"/>
+          <w:szCs w:val="28"/>
+          <w:rtl/>
+          <w:lang w:bidi="fa-IR"/>
+        </w:rPr>
+        <w:t xml:space="preserve"> </w:t>
+      </w:r>
+      <w:r>
+        <w:rPr>
+          <w:rFonts w:cs="B Nazanin"/>
+          <w:sz w:val="28"/>
+          <w:szCs w:val="28"/>
+          <w:rtl/>
+          <w:lang w:bidi="fa-IR"/>
+        </w:rPr>
+        <w:br/>
+      </w:r>
+      <w:r>
+        <w:rPr>
+          <w:rFonts w:cs="B Nazanin" w:hint="cs"/>
+          <w:sz w:val="28"/>
+          <w:szCs w:val="28"/>
+          <w:rtl/>
+          <w:lang w:bidi="fa-IR"/>
+        </w:rPr>
+        <w:t>می خوریم.</w:t>
+      </w:r>
+      <w:r>
+        <w:rPr>
+          <w:rFonts w:cs="B Nazanin" w:hint="cs"/>
+          <w:sz w:val="28"/>
+          <w:szCs w:val="28"/>
+          <w:rtl/>
+          <w:lang w:bidi="fa-IR"/>
+        </w:rPr>
+        <w:t xml:space="preserve"> پس قبل از </w:t>
+      </w:r>
+      <w:r>
+        <w:rPr>
+          <w:rFonts w:cs="B Nazanin"/>
+          <w:sz w:val="28"/>
+          <w:szCs w:val="28"/>
+          <w:lang w:bidi="fa-IR"/>
+        </w:rPr>
+        <w:t>lock</w:t>
+      </w:r>
+      <w:r>
+        <w:rPr>
+          <w:rFonts w:cs="B Nazanin" w:hint="cs"/>
+          <w:sz w:val="28"/>
+          <w:szCs w:val="28"/>
+          <w:rtl/>
+          <w:lang w:bidi="fa-IR"/>
+        </w:rPr>
+        <w:t xml:space="preserve"> هم یه بار دیگه شرط </w:t>
+      </w:r>
+      <w:r>
+        <w:rPr>
+          <w:rFonts w:cs="B Nazanin"/>
+          <w:sz w:val="28"/>
+          <w:szCs w:val="28"/>
+          <w:lang w:bidi="fa-IR"/>
+        </w:rPr>
+        <w:t>null</w:t>
+      </w:r>
+      <w:r>
+        <w:rPr>
+          <w:rFonts w:cs="B Nazanin" w:hint="cs"/>
+          <w:sz w:val="28"/>
+          <w:szCs w:val="28"/>
+          <w:rtl/>
+          <w:lang w:bidi="fa-IR"/>
+        </w:rPr>
+        <w:t xml:space="preserve"> بودن رو میذاریم. این باعث میشه که نهایتا به تعداد </w:t>
+      </w:r>
+      <w:r>
+        <w:rPr>
+          <w:rFonts w:cs="B Nazanin"/>
+          <w:sz w:val="28"/>
+          <w:szCs w:val="28"/>
+          <w:lang w:bidi="fa-IR"/>
+        </w:rPr>
+        <w:t>core</w:t>
+      </w:r>
+      <w:r>
+        <w:rPr>
+          <w:rFonts w:cs="B Nazanin" w:hint="cs"/>
+          <w:sz w:val="28"/>
+          <w:szCs w:val="28"/>
+          <w:rtl/>
+          <w:lang w:bidi="fa-IR"/>
+        </w:rPr>
+        <w:t xml:space="preserve"> های </w:t>
+      </w:r>
+      <w:r>
+        <w:rPr>
+          <w:rFonts w:cs="B Nazanin"/>
+          <w:sz w:val="28"/>
+          <w:szCs w:val="28"/>
+          <w:lang w:bidi="fa-IR"/>
+        </w:rPr>
+        <w:t>cpu</w:t>
+      </w:r>
+      <w:r>
+        <w:rPr>
+          <w:rFonts w:cs="B Nazanin" w:hint="cs"/>
+          <w:sz w:val="28"/>
+          <w:szCs w:val="28"/>
+          <w:rtl/>
+          <w:lang w:bidi="fa-IR"/>
+        </w:rPr>
+        <w:t xml:space="preserve"> مون </w:t>
+      </w:r>
+      <w:r>
+        <w:rPr>
+          <w:rFonts w:cs="B Nazanin"/>
+          <w:sz w:val="28"/>
+          <w:szCs w:val="28"/>
+          <w:lang w:bidi="fa-IR"/>
+        </w:rPr>
+        <w:t>thread</w:t>
+      </w:r>
+      <w:r>
+        <w:rPr>
+          <w:rFonts w:cs="B Nazanin" w:hint="cs"/>
+          <w:sz w:val="28"/>
+          <w:szCs w:val="28"/>
+          <w:rtl/>
+          <w:lang w:bidi="fa-IR"/>
+        </w:rPr>
+        <w:t xml:space="preserve"> بیاد پشت </w:t>
+      </w:r>
+      <w:r>
+        <w:rPr>
+          <w:rFonts w:cs="B Nazanin"/>
+          <w:sz w:val="28"/>
+          <w:szCs w:val="28"/>
+          <w:lang w:bidi="fa-IR"/>
+        </w:rPr>
+        <w:t>lock</w:t>
+      </w:r>
+      <w:r>
+        <w:rPr>
+          <w:rFonts w:cs="B Nazanin" w:hint="cs"/>
+          <w:sz w:val="28"/>
+          <w:szCs w:val="28"/>
+          <w:rtl/>
+          <w:lang w:bidi="fa-IR"/>
+        </w:rPr>
+        <w:t xml:space="preserve"> منتظر بشه. </w:t>
       </w:r>
       <w:r>
         <w:rPr>
@@ -2252,265 +3803,7 @@
           <w:lang w:bidi="fa-IR"/>
         </w:rPr>
         <w:lastRenderedPageBreak/>
-        <w:t xml:space="preserve">تعداد زیادی </w:t>
-      </w:r>
-      <w:r>
-        <w:rPr>
-          <w:rFonts w:cs="B Nazanin"/>
-          <w:sz w:val="28"/>
-          <w:szCs w:val="28"/>
-          <w:lang w:bidi="fa-IR"/>
-        </w:rPr>
-        <w:t>thread</w:t>
-      </w:r>
-      <w:r>
-        <w:rPr>
-          <w:rFonts w:cs="B Nazanin" w:hint="cs"/>
-          <w:sz w:val="28"/>
-          <w:szCs w:val="28"/>
-          <w:rtl/>
-          <w:lang w:bidi="fa-IR"/>
-        </w:rPr>
-        <w:t xml:space="preserve"> میان و یکیشون وارد </w:t>
-      </w:r>
-      <w:r>
-        <w:rPr>
-          <w:rFonts w:cs="B Nazanin"/>
-          <w:sz w:val="28"/>
-          <w:szCs w:val="28"/>
-          <w:lang w:bidi="fa-IR"/>
-        </w:rPr>
-        <w:t>lock</w:t>
-      </w:r>
-      <w:r>
-        <w:rPr>
-          <w:rFonts w:cs="B Nazanin" w:hint="cs"/>
-          <w:sz w:val="28"/>
-          <w:szCs w:val="28"/>
-          <w:rtl/>
-          <w:lang w:bidi="fa-IR"/>
-        </w:rPr>
-        <w:t xml:space="preserve"> میشه. باقی </w:t>
-      </w:r>
-      <w:r>
-        <w:rPr>
-          <w:rFonts w:cs="B Nazanin"/>
-          <w:sz w:val="28"/>
-          <w:szCs w:val="28"/>
-          <w:lang w:bidi="fa-IR"/>
-        </w:rPr>
-        <w:t>thread</w:t>
-      </w:r>
-      <w:r>
-        <w:rPr>
-          <w:rFonts w:cs="B Nazanin" w:hint="cs"/>
-          <w:sz w:val="28"/>
-          <w:szCs w:val="28"/>
-          <w:rtl/>
-          <w:lang w:bidi="fa-IR"/>
-        </w:rPr>
-        <w:t xml:space="preserve"> ها پشت سرش می مونن تا این </w:t>
-      </w:r>
-      <w:r>
-        <w:rPr>
-          <w:rFonts w:cs="B Nazanin"/>
-          <w:sz w:val="28"/>
-          <w:szCs w:val="28"/>
-          <w:lang w:bidi="fa-IR"/>
-        </w:rPr>
-        <w:t>lock</w:t>
-      </w:r>
-      <w:r>
-        <w:rPr>
-          <w:rFonts w:cs="B Nazanin" w:hint="cs"/>
-          <w:sz w:val="28"/>
-          <w:szCs w:val="28"/>
-          <w:rtl/>
-          <w:lang w:bidi="fa-IR"/>
-        </w:rPr>
-        <w:t xml:space="preserve"> رو </w:t>
-      </w:r>
-      <w:r>
-        <w:rPr>
-          <w:rFonts w:cs="B Nazanin"/>
-          <w:sz w:val="28"/>
-          <w:szCs w:val="28"/>
-          <w:lang w:bidi="fa-IR"/>
-        </w:rPr>
-        <w:t>release</w:t>
-      </w:r>
-      <w:r>
-        <w:rPr>
-          <w:rFonts w:cs="B Nazanin" w:hint="cs"/>
-          <w:sz w:val="28"/>
-          <w:szCs w:val="28"/>
-          <w:rtl/>
-          <w:lang w:bidi="fa-IR"/>
-        </w:rPr>
-        <w:t xml:space="preserve"> کنه. در نتیجه به </w:t>
-      </w:r>
-      <w:r>
-        <w:rPr>
-          <w:rFonts w:cs="B Nazanin"/>
-          <w:sz w:val="28"/>
-          <w:szCs w:val="28"/>
-          <w:lang w:bidi="fa-IR"/>
-        </w:rPr>
-        <w:t>race condition</w:t>
-      </w:r>
-      <w:r>
-        <w:rPr>
-          <w:rFonts w:cs="B Nazanin" w:hint="cs"/>
-          <w:sz w:val="28"/>
-          <w:szCs w:val="28"/>
-          <w:rtl/>
-          <w:lang w:bidi="fa-IR"/>
-        </w:rPr>
-        <w:t xml:space="preserve"> </w:t>
-      </w:r>
-      <w:r>
-        <w:rPr>
-          <w:rFonts w:cs="B Nazanin"/>
-          <w:sz w:val="28"/>
-          <w:szCs w:val="28"/>
-          <w:rtl/>
-          <w:lang w:bidi="fa-IR"/>
-        </w:rPr>
-        <w:br/>
-      </w:r>
-      <w:r>
-        <w:rPr>
-          <w:rFonts w:cs="B Nazanin" w:hint="cs"/>
-          <w:sz w:val="28"/>
-          <w:szCs w:val="28"/>
-          <w:rtl/>
-          <w:lang w:bidi="fa-IR"/>
-        </w:rPr>
-        <w:t>می خوریم.</w:t>
-      </w:r>
-      <w:r>
-        <w:rPr>
-          <w:rFonts w:cs="B Nazanin" w:hint="cs"/>
-          <w:sz w:val="28"/>
-          <w:szCs w:val="28"/>
-          <w:rtl/>
-          <w:lang w:bidi="fa-IR"/>
-        </w:rPr>
-        <w:t xml:space="preserve"> پس قبل از </w:t>
-      </w:r>
-      <w:r>
-        <w:rPr>
-          <w:rFonts w:cs="B Nazanin"/>
-          <w:sz w:val="28"/>
-          <w:szCs w:val="28"/>
-          <w:lang w:bidi="fa-IR"/>
-        </w:rPr>
-        <w:t>lock</w:t>
-      </w:r>
-      <w:r>
-        <w:rPr>
-          <w:rFonts w:cs="B Nazanin" w:hint="cs"/>
-          <w:sz w:val="28"/>
-          <w:szCs w:val="28"/>
-          <w:rtl/>
-          <w:lang w:bidi="fa-IR"/>
-        </w:rPr>
-        <w:t xml:space="preserve"> هم یه بار دیگه شرط </w:t>
-      </w:r>
-      <w:r>
-        <w:rPr>
-          <w:rFonts w:cs="B Nazanin"/>
-          <w:sz w:val="28"/>
-          <w:szCs w:val="28"/>
-          <w:lang w:bidi="fa-IR"/>
-        </w:rPr>
-        <w:t>null</w:t>
-      </w:r>
-      <w:r>
-        <w:rPr>
-          <w:rFonts w:cs="B Nazanin" w:hint="cs"/>
-          <w:sz w:val="28"/>
-          <w:szCs w:val="28"/>
-          <w:rtl/>
-          <w:lang w:bidi="fa-IR"/>
-        </w:rPr>
-        <w:t xml:space="preserve"> بودن رو میذاریم. این باعث میشه که نهایتا به تعداد </w:t>
-      </w:r>
-      <w:r>
-        <w:rPr>
-          <w:rFonts w:cs="B Nazanin"/>
-          <w:sz w:val="28"/>
-          <w:szCs w:val="28"/>
-          <w:lang w:bidi="fa-IR"/>
-        </w:rPr>
-        <w:t>core</w:t>
-      </w:r>
-      <w:r>
-        <w:rPr>
-          <w:rFonts w:cs="B Nazanin" w:hint="cs"/>
-          <w:sz w:val="28"/>
-          <w:szCs w:val="28"/>
-          <w:rtl/>
-          <w:lang w:bidi="fa-IR"/>
-        </w:rPr>
-        <w:t xml:space="preserve"> های </w:t>
-      </w:r>
-      <w:r>
-        <w:rPr>
-          <w:rFonts w:cs="B Nazanin"/>
-          <w:sz w:val="28"/>
-          <w:szCs w:val="28"/>
-          <w:lang w:bidi="fa-IR"/>
-        </w:rPr>
-        <w:t>cpu</w:t>
-      </w:r>
-      <w:r>
-        <w:rPr>
-          <w:rFonts w:cs="B Nazanin" w:hint="cs"/>
-          <w:sz w:val="28"/>
-          <w:szCs w:val="28"/>
-          <w:rtl/>
-          <w:lang w:bidi="fa-IR"/>
-        </w:rPr>
-        <w:t xml:space="preserve"> مون </w:t>
-      </w:r>
-      <w:r>
-        <w:rPr>
-          <w:rFonts w:cs="B Nazanin"/>
-          <w:sz w:val="28"/>
-          <w:szCs w:val="28"/>
-          <w:lang w:bidi="fa-IR"/>
-        </w:rPr>
-        <w:t>thread</w:t>
-      </w:r>
-      <w:r>
-        <w:rPr>
-          <w:rFonts w:cs="B Nazanin" w:hint="cs"/>
-          <w:sz w:val="28"/>
-          <w:szCs w:val="28"/>
-          <w:rtl/>
-          <w:lang w:bidi="fa-IR"/>
-        </w:rPr>
-        <w:t xml:space="preserve"> بیاد پشت </w:t>
-      </w:r>
-      <w:r>
-        <w:rPr>
-          <w:rFonts w:cs="B Nazanin"/>
-          <w:sz w:val="28"/>
-          <w:szCs w:val="28"/>
-          <w:lang w:bidi="fa-IR"/>
-        </w:rPr>
-        <w:t>lock</w:t>
-      </w:r>
-      <w:r>
-        <w:rPr>
-          <w:rFonts w:cs="B Nazanin" w:hint="cs"/>
-          <w:sz w:val="28"/>
-          <w:szCs w:val="28"/>
-          <w:rtl/>
-          <w:lang w:bidi="fa-IR"/>
-        </w:rPr>
-        <w:t xml:space="preserve"> منتظر بشه. بعدش یکی وارد </w:t>
+        <w:t xml:space="preserve">بعدش یکی وارد </w:t>
       </w:r>
       <w:r>
         <w:rPr>
@@ -3654,18 +4947,7 @@
           <w:rtl/>
           <w:lang w:bidi="fa-IR"/>
         </w:rPr>
-        <w:t xml:space="preserve"> استفاده می کنیم </w:t>
-      </w:r>
-      <w:r>
-        <w:rPr>
-          <w:rFonts w:cs="B Nazanin" w:hint="cs"/>
-          <w:sz w:val="28"/>
-          <w:szCs w:val="28"/>
-          <w:rtl/>
-          <w:lang w:bidi="fa-IR"/>
-        </w:rPr>
-        <w:lastRenderedPageBreak/>
-        <w:t xml:space="preserve">که برای یه کلاس، فقط یه بار </w:t>
+        <w:t xml:space="preserve"> استفاده می کنیم که برای یه کلاس، فقط یه بار </w:t>
       </w:r>
       <w:r>
         <w:rPr>
@@ -4613,7 +5895,7 @@
                     <pic:cNvPicPr/>
                   </pic:nvPicPr>
                   <pic:blipFill>
-                    <a:blip r:embed="rId6" cstate="print">
+                    <a:blip r:embed="rId7" cstate="print">
                       <a:extLst>
                         <a:ext uri="{28A0092B-C50C-407E-A947-70E740481C1C}">
                           <a14:useLocalDpi xmlns:a14="http://schemas.microsoft.com/office/drawing/2010/main" val="0"/>
@@ -5151,7 +6433,6 @@
           <w:rtl/>
           <w:lang w:bidi="fa-IR"/>
         </w:rPr>
-        <w:lastRenderedPageBreak/>
         <w:t>مدت زمان توسعه اولیه برای زدن این پترن بیشتره. چیزی که معمولا خودم به کار میبرم اینه که اول کد رو بدون این پترن میزنم و بعد شرایط استفاده از این پترن رو ارزیابی می کنم که اگه به صرفه بود اونوقت جایگزین کد فعلی کنم.</w:t>
       </w:r>
     </w:p>
@@ -5286,6 +6567,7 @@
           <w:szCs w:val="28"/>
           <w:lang w:bidi="fa-IR"/>
         </w:rPr>
+        <w:lastRenderedPageBreak/>
         <w:br w:type="page"/>
       </w:r>
     </w:p>
@@ -5499,7 +6781,7 @@
                     <pic:cNvPicPr/>
                   </pic:nvPicPr>
                   <pic:blipFill>
-                    <a:blip r:embed="rId7"/>
+                    <a:blip r:embed="rId8"/>
                     <a:stretch>
                       <a:fillRect/>
                     </a:stretch>
@@ -5991,7 +7273,6 @@
           <w:rtl/>
           <w:lang w:bidi="fa-IR"/>
         </w:rPr>
-        <w:lastRenderedPageBreak/>
         <w:t>مزایا:</w:t>
       </w:r>
     </w:p>
@@ -6127,6 +7408,7 @@
           <w:rtl/>
           <w:lang w:bidi="fa-IR"/>
         </w:rPr>
+        <w:lastRenderedPageBreak/>
         <w:t xml:space="preserve">جلوگیری از </w:t>
       </w:r>
       <w:r>

</xml_diff>